<commit_message>
Modified receiver and transmitter codes so they can communicate.
</commit_message>
<xml_diff>
--- a/CAN Documentaiton Notes.docx
+++ b/CAN Documentaiton Notes.docx
@@ -158,10 +158,7 @@
         <w:sym w:font="Wingdings" w:char="F0E0"/>
       </w:r>
       <w:r>
-        <w:t xml:space="preserve"> 0x61</w:t>
-      </w:r>
-      <w:r>
-        <w:t>)</w:t>
+        <w:t xml:space="preserve"> 0x61)</w:t>
       </w:r>
       <w:r>
         <w:t xml:space="preserve"> ----</w:t>
@@ -194,10 +191,7 @@
         <w:t>2051880</w:t>
       </w:r>
       <w:r>
-        <w:t xml:space="preserve"> (</w:t>
-      </w:r>
-      <w:r>
-        <w:t xml:space="preserve">API ID: </w:t>
+        <w:t xml:space="preserve"> (API ID: </w:t>
       </w:r>
       <w:r>
         <w:t>0x2e0</w:t>
@@ -209,10 +203,7 @@
         <w:sym w:font="Wingdings" w:char="F0E0"/>
       </w:r>
       <w:r>
-        <w:t xml:space="preserve"> 0x62</w:t>
-      </w:r>
-      <w:r>
-        <w:t>)</w:t>
+        <w:t xml:space="preserve"> 0x62)</w:t>
       </w:r>
     </w:p>
     <w:p>
@@ -484,6 +475,283 @@
         <w:t xml:space="preserve"> It could a problem with the power supply </w:t>
       </w:r>
     </w:p>
+    <w:p>
+      <w:pPr>
+        <w:pStyle w:val="ListParagraph"/>
+        <w:numPr>
+          <w:ilvl w:val="0"/>
+          <w:numId w:val="1"/>
+        </w:numPr>
+      </w:pPr>
+      <w:r>
+        <w:t xml:space="preserve">Conclusion: </w:t>
+      </w:r>
+    </w:p>
+    <w:p>
+      <w:pPr>
+        <w:pStyle w:val="ListParagraph"/>
+        <w:numPr>
+          <w:ilvl w:val="1"/>
+          <w:numId w:val="1"/>
+        </w:numPr>
+      </w:pPr>
+      <w:r>
+        <w:t xml:space="preserve">It still had same problem. </w:t>
+      </w:r>
+    </w:p>
+    <w:p>
+      <w:pPr>
+        <w:rPr>
+          <w:b/>
+          <w:bCs/>
+          <w:u w:val="single"/>
+        </w:rPr>
+      </w:pPr>
+      <w:r>
+        <w:br w:type="page"/>
+      </w:r>
+      <w:r>
+        <w:rPr>
+          <w:b/>
+          <w:bCs/>
+          <w:u w:val="single"/>
+        </w:rPr>
+        <w:lastRenderedPageBreak/>
+        <w:t xml:space="preserve">New Task: </w:t>
+      </w:r>
+    </w:p>
+    <w:p>
+      <w:r>
+        <w:t xml:space="preserve">Create the pipeline that allows for global CAN communication between the “Jetson” and the “ESP32/motor driver” </w:t>
+      </w:r>
+    </w:p>
+    <w:p>
+      <w:r>
+        <w:rPr>
+          <w:noProof/>
+        </w:rPr>
+        <w:drawing>
+          <wp:inline distT="0" distB="0" distL="0" distR="0" wp14:anchorId="7E64FA5A" wp14:editId="7203E73D">
+            <wp:extent cx="5943600" cy="4457700"/>
+            <wp:effectExtent l="0" t="0" r="0" b="0"/>
+            <wp:docPr id="1694434446" name="Picture 1"/>
+            <wp:cNvGraphicFramePr>
+              <a:graphicFrameLocks xmlns:a="http://schemas.openxmlformats.org/drawingml/2006/main" noChangeAspect="1"/>
+            </wp:cNvGraphicFramePr>
+            <a:graphic xmlns:a="http://schemas.openxmlformats.org/drawingml/2006/main">
+              <a:graphicData uri="http://schemas.openxmlformats.org/drawingml/2006/picture">
+                <pic:pic xmlns:pic="http://schemas.openxmlformats.org/drawingml/2006/picture">
+                  <pic:nvPicPr>
+                    <pic:cNvPr id="1694434446" name="Picture 1694434446"/>
+                    <pic:cNvPicPr/>
+                  </pic:nvPicPr>
+                  <pic:blipFill>
+                    <a:blip r:embed="rId6" cstate="print">
+                      <a:extLst>
+                        <a:ext uri="{28A0092B-C50C-407E-A947-70E740481C1C}">
+                          <a14:useLocalDpi xmlns:a14="http://schemas.microsoft.com/office/drawing/2010/main" val="0"/>
+                        </a:ext>
+                      </a:extLst>
+                    </a:blip>
+                    <a:stretch>
+                      <a:fillRect/>
+                    </a:stretch>
+                  </pic:blipFill>
+                  <pic:spPr>
+                    <a:xfrm>
+                      <a:off x="0" y="0"/>
+                      <a:ext cx="5943600" cy="4457700"/>
+                    </a:xfrm>
+                    <a:prstGeom prst="rect">
+                      <a:avLst/>
+                    </a:prstGeom>
+                  </pic:spPr>
+                </pic:pic>
+              </a:graphicData>
+            </a:graphic>
+          </wp:inline>
+        </w:drawing>
+      </w:r>
+    </w:p>
+    <w:p>
+      <w:pPr>
+        <w:ind w:left="360"/>
+      </w:pPr>
+    </w:p>
+    <w:p>
+      <w:r>
+        <w:t xml:space="preserve">My laptop + an ESP32 will act as Big J (the Jetson). Here’s the idea: </w:t>
+      </w:r>
+    </w:p>
+    <w:p>
+      <w:pPr>
+        <w:pStyle w:val="ListParagraph"/>
+        <w:numPr>
+          <w:ilvl w:val="0"/>
+          <w:numId w:val="3"/>
+        </w:numPr>
+      </w:pPr>
+      <w:r>
+        <w:t>Big J wants a motor to move 50 degrees</w:t>
+      </w:r>
+    </w:p>
+    <w:p>
+      <w:pPr>
+        <w:pStyle w:val="ListParagraph"/>
+        <w:numPr>
+          <w:ilvl w:val="0"/>
+          <w:numId w:val="3"/>
+        </w:numPr>
+      </w:pPr>
+      <w:r>
+        <w:t xml:space="preserve">It encodes the message in </w:t>
+      </w:r>
+      <w:proofErr w:type="spellStart"/>
+      <w:r>
+        <w:t>hexcode</w:t>
+      </w:r>
+      <w:proofErr w:type="spellEnd"/>
+      <w:r>
+        <w:t xml:space="preserve"> (ex. “M,50” </w:t>
+      </w:r>
+      <w:r>
+        <w:sym w:font="Wingdings" w:char="F0E0"/>
+      </w:r>
+      <w:r>
+        <w:t xml:space="preserve"> 003 004 002 055) </w:t>
+      </w:r>
+      <w:r>
+        <w:sym w:font="Wingdings" w:char="F0DF"/>
+      </w:r>
+      <w:r>
+        <w:t xml:space="preserve"> probably not right……</w:t>
+      </w:r>
+    </w:p>
+    <w:p>
+      <w:pPr>
+        <w:pStyle w:val="ListParagraph"/>
+        <w:numPr>
+          <w:ilvl w:val="0"/>
+          <w:numId w:val="3"/>
+        </w:numPr>
+      </w:pPr>
+      <w:r>
+        <w:t xml:space="preserve">It sends the message to the “motor controller” (MC), which is an ESP32 shielded with a motor driver. </w:t>
+      </w:r>
+    </w:p>
+    <w:p>
+      <w:pPr>
+        <w:pStyle w:val="ListParagraph"/>
+        <w:numPr>
+          <w:ilvl w:val="0"/>
+          <w:numId w:val="3"/>
+        </w:numPr>
+      </w:pPr>
+      <w:r>
+        <w:t>The MC decodes the message and extracts the useful information (50 degrees)</w:t>
+      </w:r>
+    </w:p>
+    <w:p>
+      <w:pPr>
+        <w:pStyle w:val="ListParagraph"/>
+        <w:numPr>
+          <w:ilvl w:val="0"/>
+          <w:numId w:val="3"/>
+        </w:numPr>
+      </w:pPr>
+      <w:r>
+        <w:t xml:space="preserve">The MC makes a function call to FOC (passing 50 degrees as an argument). FOC will do the complex math (like how many times to fire the coils. Yikes!) to make the motor move 50 degrees </w:t>
+      </w:r>
+    </w:p>
+    <w:p>
+      <w:pPr>
+        <w:pStyle w:val="ListParagraph"/>
+        <w:numPr>
+          <w:ilvl w:val="1"/>
+          <w:numId w:val="3"/>
+        </w:numPr>
+      </w:pPr>
+      <w:r>
+        <w:t>Additionally, when the motor has moved 50 degrees, an encoder on the motor could send a confirmation back to Big J that the motor has been moved 50 degrees</w:t>
+      </w:r>
+    </w:p>
+    <w:p>
+      <w:pPr>
+        <w:pStyle w:val="ListParagraph"/>
+        <w:numPr>
+          <w:ilvl w:val="0"/>
+          <w:numId w:val="3"/>
+        </w:numPr>
+        <w:jc w:val="both"/>
+      </w:pPr>
+      <w:r>
+        <w:t xml:space="preserve">If Big J want the current from a motor, it encodes the message (ex. “M, C?” </w:t>
+      </w:r>
+      <w:r>
+        <w:sym w:font="Wingdings" w:char="F0E0"/>
+      </w:r>
+      <w:r>
+        <w:t xml:space="preserve"> 04 304 304 34) </w:t>
+      </w:r>
+      <w:r>
+        <w:sym w:font="Wingdings" w:char="F0DF"/>
+      </w:r>
+      <w:r>
+        <w:t xml:space="preserve"> not even close </w:t>
+      </w:r>
+      <w:proofErr w:type="gramStart"/>
+      <w:r>
+        <w:t>…..</w:t>
+      </w:r>
+      <w:proofErr w:type="gramEnd"/>
+      <w:r>
+        <w:t xml:space="preserve"> </w:t>
+      </w:r>
+    </w:p>
+    <w:p>
+      <w:pPr>
+        <w:pStyle w:val="ListParagraph"/>
+        <w:numPr>
+          <w:ilvl w:val="0"/>
+          <w:numId w:val="3"/>
+        </w:numPr>
+        <w:jc w:val="both"/>
+      </w:pPr>
+      <w:r>
+        <w:lastRenderedPageBreak/>
+        <w:t>Same as steps 3 and 4</w:t>
+      </w:r>
+    </w:p>
+    <w:p>
+      <w:pPr>
+        <w:pStyle w:val="ListParagraph"/>
+        <w:numPr>
+          <w:ilvl w:val="0"/>
+          <w:numId w:val="3"/>
+        </w:numPr>
+        <w:jc w:val="both"/>
+      </w:pPr>
+      <w:r>
+        <w:t>MC calls FOC</w:t>
+      </w:r>
+      <w:r>
+        <w:t xml:space="preserve"> to read the current value</w:t>
+      </w:r>
+    </w:p>
+    <w:p>
+      <w:pPr>
+        <w:pStyle w:val="ListParagraph"/>
+        <w:numPr>
+          <w:ilvl w:val="1"/>
+          <w:numId w:val="3"/>
+        </w:numPr>
+        <w:jc w:val="both"/>
+      </w:pPr>
+      <w:r>
+        <w:t xml:space="preserve">Additionally, we can have a dashboard that constantly displays all the useful information (current, velocity, voltage, position) </w:t>
+      </w:r>
+    </w:p>
+    <w:p/>
     <w:sectPr>
       <w:pgSz w:w="12240" w:h="15840"/>
       <w:pgMar w:top="1440" w:right="1440" w:bottom="1440" w:left="1440" w:header="708" w:footer="708" w:gutter="0"/>
@@ -497,18 +765,357 @@
 <file path=word/numbering.xml><?xml version="1.0" encoding="utf-8"?>
 <w:numbering xmlns:wpc="http://schemas.microsoft.com/office/word/2010/wordprocessingCanvas" xmlns:cx="http://schemas.microsoft.com/office/drawing/2014/chartex" xmlns:cx1="http://schemas.microsoft.com/office/drawing/2015/9/8/chartex" xmlns:cx2="http://schemas.microsoft.com/office/drawing/2015/10/21/chartex" xmlns:cx3="http://schemas.microsoft.com/office/drawing/2016/5/9/chartex" xmlns:cx4="http://schemas.microsoft.com/office/drawing/2016/5/10/chartex" xmlns:cx5="http://schemas.microsoft.com/office/drawing/2016/5/11/chartex" xmlns:cx6="http://schemas.microsoft.com/office/drawing/2016/5/12/chartex" xmlns:cx7="http://schemas.microsoft.com/office/drawing/2016/5/13/chartex" xmlns:cx8="http://schemas.microsoft.com/office/drawing/2016/5/14/chartex" xmlns:mc="http://schemas.openxmlformats.org/markup-compatibility/2006" xmlns:aink="http://schemas.microsoft.com/office/drawing/2016/ink" xmlns:am3d="http://schemas.microsoft.com/office/drawing/2017/model3d" xmlns:o="urn:schemas-microsoft-com:office:office" xmlns:oel="http://schemas.microsoft.com/office/2019/extlst" xmlns:r="http://schemas.openxmlformats.org/officeDocument/2006/relationships" xmlns:m="http://schemas.openxmlformats.org/officeDocument/2006/math" xmlns:v="urn:schemas-microsoft-com:vml" xmlns:wp14="http://schemas.microsoft.com/office/word/2010/wordprocessingDrawing" xmlns:wp="http://schemas.openxmlformats.org/drawingml/2006/wordprocessingDrawing" xmlns:w10="urn:schemas-microsoft-com:office:word" xmlns:w="http://schemas.openxmlformats.org/wordprocessingml/2006/main" xmlns:w14="http://schemas.microsoft.com/office/word/2010/wordml" xmlns:w15="http://schemas.microsoft.com/office/word/2012/wordml" xmlns:w16cex="http://schemas.microsoft.com/office/word/2018/wordml/cex" xmlns:w16cid="http://schemas.microsoft.com/office/word/2016/wordml/cid" xmlns:w16="http://schemas.microsoft.com/office/word/2018/wordml" xmlns:w16du="http://schemas.microsoft.com/office/word/2023/wordml/word16du" xmlns:w16sdtdh="http://schemas.microsoft.com/office/word/2020/wordml/sdtdatahash" xmlns:w16sdtfl="http://schemas.microsoft.com/office/word/2024/wordml/sdtformatlock" xmlns:w16se="http://schemas.microsoft.com/office/word/2015/wordml/symex" xmlns:wpg="http://schemas.microsoft.com/office/word/2010/wordprocessingGroup" xmlns:wpi="http://schemas.microsoft.com/office/word/2010/wordprocessingInk" xmlns:wne="http://schemas.microsoft.com/office/word/2006/wordml" xmlns:wps="http://schemas.microsoft.com/office/word/2010/wordprocessingShape" mc:Ignorable="w14 w15 w16se w16cid w16 w16cex w16sdtdh w16sdtfl w16du wp14">
   <w:abstractNum w:abstractNumId="0" w15:restartNumberingAfterBreak="0">
+    <w:nsid w:val="1D697CA3"/>
+    <w:multiLevelType w:val="hybridMultilevel"/>
+    <w:tmpl w:val="09FA1DCA"/>
+    <w:lvl w:ilvl="0" w:tplc="D8F6F0BC">
+      <w:numFmt w:val="bullet"/>
+      <w:lvlText w:val=""/>
+      <w:lvlJc w:val="left"/>
+      <w:pPr>
+        <w:ind w:left="720" w:hanging="360"/>
+      </w:pPr>
+      <w:rPr>
+        <w:rFonts w:ascii="Symbol" w:eastAsiaTheme="minorHAnsi" w:hAnsi="Symbol" w:cstheme="minorBidi" w:hint="default"/>
+      </w:rPr>
+    </w:lvl>
+    <w:lvl w:ilvl="1" w:tplc="10090003" w:tentative="1">
+      <w:start w:val="1"/>
+      <w:numFmt w:val="bullet"/>
+      <w:lvlText w:val="o"/>
+      <w:lvlJc w:val="left"/>
+      <w:pPr>
+        <w:ind w:left="1440" w:hanging="360"/>
+      </w:pPr>
+      <w:rPr>
+        <w:rFonts w:ascii="Courier New" w:hAnsi="Courier New" w:cs="Courier New" w:hint="default"/>
+      </w:rPr>
+    </w:lvl>
+    <w:lvl w:ilvl="2" w:tplc="10090005" w:tentative="1">
+      <w:start w:val="1"/>
+      <w:numFmt w:val="bullet"/>
+      <w:lvlText w:val=""/>
+      <w:lvlJc w:val="left"/>
+      <w:pPr>
+        <w:ind w:left="2160" w:hanging="360"/>
+      </w:pPr>
+      <w:rPr>
+        <w:rFonts w:ascii="Wingdings" w:hAnsi="Wingdings" w:hint="default"/>
+      </w:rPr>
+    </w:lvl>
+    <w:lvl w:ilvl="3" w:tplc="10090001" w:tentative="1">
+      <w:start w:val="1"/>
+      <w:numFmt w:val="bullet"/>
+      <w:lvlText w:val=""/>
+      <w:lvlJc w:val="left"/>
+      <w:pPr>
+        <w:ind w:left="2880" w:hanging="360"/>
+      </w:pPr>
+      <w:rPr>
+        <w:rFonts w:ascii="Symbol" w:hAnsi="Symbol" w:hint="default"/>
+      </w:rPr>
+    </w:lvl>
+    <w:lvl w:ilvl="4" w:tplc="10090003" w:tentative="1">
+      <w:start w:val="1"/>
+      <w:numFmt w:val="bullet"/>
+      <w:lvlText w:val="o"/>
+      <w:lvlJc w:val="left"/>
+      <w:pPr>
+        <w:ind w:left="3600" w:hanging="360"/>
+      </w:pPr>
+      <w:rPr>
+        <w:rFonts w:ascii="Courier New" w:hAnsi="Courier New" w:cs="Courier New" w:hint="default"/>
+      </w:rPr>
+    </w:lvl>
+    <w:lvl w:ilvl="5" w:tplc="10090005" w:tentative="1">
+      <w:start w:val="1"/>
+      <w:numFmt w:val="bullet"/>
+      <w:lvlText w:val=""/>
+      <w:lvlJc w:val="left"/>
+      <w:pPr>
+        <w:ind w:left="4320" w:hanging="360"/>
+      </w:pPr>
+      <w:rPr>
+        <w:rFonts w:ascii="Wingdings" w:hAnsi="Wingdings" w:hint="default"/>
+      </w:rPr>
+    </w:lvl>
+    <w:lvl w:ilvl="6" w:tplc="10090001" w:tentative="1">
+      <w:start w:val="1"/>
+      <w:numFmt w:val="bullet"/>
+      <w:lvlText w:val=""/>
+      <w:lvlJc w:val="left"/>
+      <w:pPr>
+        <w:ind w:left="5040" w:hanging="360"/>
+      </w:pPr>
+      <w:rPr>
+        <w:rFonts w:ascii="Symbol" w:hAnsi="Symbol" w:hint="default"/>
+      </w:rPr>
+    </w:lvl>
+    <w:lvl w:ilvl="7" w:tplc="10090003" w:tentative="1">
+      <w:start w:val="1"/>
+      <w:numFmt w:val="bullet"/>
+      <w:lvlText w:val="o"/>
+      <w:lvlJc w:val="left"/>
+      <w:pPr>
+        <w:ind w:left="5760" w:hanging="360"/>
+      </w:pPr>
+      <w:rPr>
+        <w:rFonts w:ascii="Courier New" w:hAnsi="Courier New" w:cs="Courier New" w:hint="default"/>
+      </w:rPr>
+    </w:lvl>
+    <w:lvl w:ilvl="8" w:tplc="10090005" w:tentative="1">
+      <w:start w:val="1"/>
+      <w:numFmt w:val="bullet"/>
+      <w:lvlText w:val=""/>
+      <w:lvlJc w:val="left"/>
+      <w:pPr>
+        <w:ind w:left="6480" w:hanging="360"/>
+      </w:pPr>
+      <w:rPr>
+        <w:rFonts w:ascii="Wingdings" w:hAnsi="Wingdings" w:hint="default"/>
+      </w:rPr>
+    </w:lvl>
+  </w:abstractNum>
+  <w:abstractNum w:abstractNumId="1" w15:restartNumberingAfterBreak="0">
+    <w:nsid w:val="23343B3E"/>
+    <w:multiLevelType w:val="hybridMultilevel"/>
+    <w:tmpl w:val="2E164FBA"/>
+    <w:lvl w:ilvl="0" w:tplc="FFFFFFFF">
+      <w:start w:val="1"/>
+      <w:numFmt w:val="decimal"/>
+      <w:lvlText w:val="%1."/>
+      <w:lvlJc w:val="left"/>
+      <w:pPr>
+        <w:ind w:left="720" w:hanging="360"/>
+      </w:pPr>
+      <w:rPr>
+        <w:rFonts w:hint="default"/>
+      </w:rPr>
+    </w:lvl>
+    <w:lvl w:ilvl="1" w:tplc="FFFFFFFF">
+      <w:start w:val="1"/>
+      <w:numFmt w:val="bullet"/>
+      <w:lvlText w:val="o"/>
+      <w:lvlJc w:val="left"/>
+      <w:pPr>
+        <w:ind w:left="1440" w:hanging="360"/>
+      </w:pPr>
+      <w:rPr>
+        <w:rFonts w:ascii="Courier New" w:hAnsi="Courier New" w:cs="Courier New" w:hint="default"/>
+      </w:rPr>
+    </w:lvl>
+    <w:lvl w:ilvl="2" w:tplc="FFFFFFFF" w:tentative="1">
+      <w:start w:val="1"/>
+      <w:numFmt w:val="bullet"/>
+      <w:lvlText w:val=""/>
+      <w:lvlJc w:val="left"/>
+      <w:pPr>
+        <w:ind w:left="2160" w:hanging="360"/>
+      </w:pPr>
+      <w:rPr>
+        <w:rFonts w:ascii="Wingdings" w:hAnsi="Wingdings" w:hint="default"/>
+      </w:rPr>
+    </w:lvl>
+    <w:lvl w:ilvl="3" w:tplc="FFFFFFFF" w:tentative="1">
+      <w:start w:val="1"/>
+      <w:numFmt w:val="bullet"/>
+      <w:lvlText w:val=""/>
+      <w:lvlJc w:val="left"/>
+      <w:pPr>
+        <w:ind w:left="2880" w:hanging="360"/>
+      </w:pPr>
+      <w:rPr>
+        <w:rFonts w:ascii="Symbol" w:hAnsi="Symbol" w:hint="default"/>
+      </w:rPr>
+    </w:lvl>
+    <w:lvl w:ilvl="4" w:tplc="FFFFFFFF" w:tentative="1">
+      <w:start w:val="1"/>
+      <w:numFmt w:val="bullet"/>
+      <w:lvlText w:val="o"/>
+      <w:lvlJc w:val="left"/>
+      <w:pPr>
+        <w:ind w:left="3600" w:hanging="360"/>
+      </w:pPr>
+      <w:rPr>
+        <w:rFonts w:ascii="Courier New" w:hAnsi="Courier New" w:cs="Courier New" w:hint="default"/>
+      </w:rPr>
+    </w:lvl>
+    <w:lvl w:ilvl="5" w:tplc="FFFFFFFF" w:tentative="1">
+      <w:start w:val="1"/>
+      <w:numFmt w:val="bullet"/>
+      <w:lvlText w:val=""/>
+      <w:lvlJc w:val="left"/>
+      <w:pPr>
+        <w:ind w:left="4320" w:hanging="360"/>
+      </w:pPr>
+      <w:rPr>
+        <w:rFonts w:ascii="Wingdings" w:hAnsi="Wingdings" w:hint="default"/>
+      </w:rPr>
+    </w:lvl>
+    <w:lvl w:ilvl="6" w:tplc="FFFFFFFF" w:tentative="1">
+      <w:start w:val="1"/>
+      <w:numFmt w:val="bullet"/>
+      <w:lvlText w:val=""/>
+      <w:lvlJc w:val="left"/>
+      <w:pPr>
+        <w:ind w:left="5040" w:hanging="360"/>
+      </w:pPr>
+      <w:rPr>
+        <w:rFonts w:ascii="Symbol" w:hAnsi="Symbol" w:hint="default"/>
+      </w:rPr>
+    </w:lvl>
+    <w:lvl w:ilvl="7" w:tplc="FFFFFFFF" w:tentative="1">
+      <w:start w:val="1"/>
+      <w:numFmt w:val="bullet"/>
+      <w:lvlText w:val="o"/>
+      <w:lvlJc w:val="left"/>
+      <w:pPr>
+        <w:ind w:left="5760" w:hanging="360"/>
+      </w:pPr>
+      <w:rPr>
+        <w:rFonts w:ascii="Courier New" w:hAnsi="Courier New" w:cs="Courier New" w:hint="default"/>
+      </w:rPr>
+    </w:lvl>
+    <w:lvl w:ilvl="8" w:tplc="FFFFFFFF" w:tentative="1">
+      <w:start w:val="1"/>
+      <w:numFmt w:val="bullet"/>
+      <w:lvlText w:val=""/>
+      <w:lvlJc w:val="left"/>
+      <w:pPr>
+        <w:ind w:left="6480" w:hanging="360"/>
+      </w:pPr>
+      <w:rPr>
+        <w:rFonts w:ascii="Wingdings" w:hAnsi="Wingdings" w:hint="default"/>
+      </w:rPr>
+    </w:lvl>
+  </w:abstractNum>
+  <w:abstractNum w:abstractNumId="2" w15:restartNumberingAfterBreak="0">
+    <w:nsid w:val="644E5697"/>
+    <w:multiLevelType w:val="hybridMultilevel"/>
+    <w:tmpl w:val="2E164FBA"/>
+    <w:lvl w:ilvl="0" w:tplc="FFFFFFFF">
+      <w:start w:val="1"/>
+      <w:numFmt w:val="decimal"/>
+      <w:lvlText w:val="%1."/>
+      <w:lvlJc w:val="left"/>
+      <w:pPr>
+        <w:ind w:left="720" w:hanging="360"/>
+      </w:pPr>
+      <w:rPr>
+        <w:rFonts w:hint="default"/>
+      </w:rPr>
+    </w:lvl>
+    <w:lvl w:ilvl="1" w:tplc="FFFFFFFF">
+      <w:start w:val="1"/>
+      <w:numFmt w:val="bullet"/>
+      <w:lvlText w:val="o"/>
+      <w:lvlJc w:val="left"/>
+      <w:pPr>
+        <w:ind w:left="1440" w:hanging="360"/>
+      </w:pPr>
+      <w:rPr>
+        <w:rFonts w:ascii="Courier New" w:hAnsi="Courier New" w:cs="Courier New" w:hint="default"/>
+      </w:rPr>
+    </w:lvl>
+    <w:lvl w:ilvl="2" w:tplc="FFFFFFFF" w:tentative="1">
+      <w:start w:val="1"/>
+      <w:numFmt w:val="bullet"/>
+      <w:lvlText w:val=""/>
+      <w:lvlJc w:val="left"/>
+      <w:pPr>
+        <w:ind w:left="2160" w:hanging="360"/>
+      </w:pPr>
+      <w:rPr>
+        <w:rFonts w:ascii="Wingdings" w:hAnsi="Wingdings" w:hint="default"/>
+      </w:rPr>
+    </w:lvl>
+    <w:lvl w:ilvl="3" w:tplc="FFFFFFFF" w:tentative="1">
+      <w:start w:val="1"/>
+      <w:numFmt w:val="bullet"/>
+      <w:lvlText w:val=""/>
+      <w:lvlJc w:val="left"/>
+      <w:pPr>
+        <w:ind w:left="2880" w:hanging="360"/>
+      </w:pPr>
+      <w:rPr>
+        <w:rFonts w:ascii="Symbol" w:hAnsi="Symbol" w:hint="default"/>
+      </w:rPr>
+    </w:lvl>
+    <w:lvl w:ilvl="4" w:tplc="FFFFFFFF" w:tentative="1">
+      <w:start w:val="1"/>
+      <w:numFmt w:val="bullet"/>
+      <w:lvlText w:val="o"/>
+      <w:lvlJc w:val="left"/>
+      <w:pPr>
+        <w:ind w:left="3600" w:hanging="360"/>
+      </w:pPr>
+      <w:rPr>
+        <w:rFonts w:ascii="Courier New" w:hAnsi="Courier New" w:cs="Courier New" w:hint="default"/>
+      </w:rPr>
+    </w:lvl>
+    <w:lvl w:ilvl="5" w:tplc="FFFFFFFF" w:tentative="1">
+      <w:start w:val="1"/>
+      <w:numFmt w:val="bullet"/>
+      <w:lvlText w:val=""/>
+      <w:lvlJc w:val="left"/>
+      <w:pPr>
+        <w:ind w:left="4320" w:hanging="360"/>
+      </w:pPr>
+      <w:rPr>
+        <w:rFonts w:ascii="Wingdings" w:hAnsi="Wingdings" w:hint="default"/>
+      </w:rPr>
+    </w:lvl>
+    <w:lvl w:ilvl="6" w:tplc="FFFFFFFF" w:tentative="1">
+      <w:start w:val="1"/>
+      <w:numFmt w:val="bullet"/>
+      <w:lvlText w:val=""/>
+      <w:lvlJc w:val="left"/>
+      <w:pPr>
+        <w:ind w:left="5040" w:hanging="360"/>
+      </w:pPr>
+      <w:rPr>
+        <w:rFonts w:ascii="Symbol" w:hAnsi="Symbol" w:hint="default"/>
+      </w:rPr>
+    </w:lvl>
+    <w:lvl w:ilvl="7" w:tplc="FFFFFFFF" w:tentative="1">
+      <w:start w:val="1"/>
+      <w:numFmt w:val="bullet"/>
+      <w:lvlText w:val="o"/>
+      <w:lvlJc w:val="left"/>
+      <w:pPr>
+        <w:ind w:left="5760" w:hanging="360"/>
+      </w:pPr>
+      <w:rPr>
+        <w:rFonts w:ascii="Courier New" w:hAnsi="Courier New" w:cs="Courier New" w:hint="default"/>
+      </w:rPr>
+    </w:lvl>
+    <w:lvl w:ilvl="8" w:tplc="FFFFFFFF" w:tentative="1">
+      <w:start w:val="1"/>
+      <w:numFmt w:val="bullet"/>
+      <w:lvlText w:val=""/>
+      <w:lvlJc w:val="left"/>
+      <w:pPr>
+        <w:ind w:left="6480" w:hanging="360"/>
+      </w:pPr>
+      <w:rPr>
+        <w:rFonts w:ascii="Wingdings" w:hAnsi="Wingdings" w:hint="default"/>
+      </w:rPr>
+    </w:lvl>
+  </w:abstractNum>
+  <w:abstractNum w:abstractNumId="3" w15:restartNumberingAfterBreak="0">
     <w:nsid w:val="72BF6157"/>
     <w:multiLevelType w:val="hybridMultilevel"/>
-    <w:tmpl w:val="0FC68CFC"/>
-    <w:lvl w:ilvl="0" w:tplc="4DDEA25C">
-      <w:numFmt w:val="bullet"/>
-      <w:lvlText w:val=""/>
+    <w:tmpl w:val="2E164FBA"/>
+    <w:lvl w:ilvl="0" w:tplc="1009000F">
+      <w:start w:val="1"/>
+      <w:numFmt w:val="decimal"/>
+      <w:lvlText w:val="%1."/>
       <w:lvlJc w:val="left"/>
       <w:pPr>
         <w:ind w:left="720" w:hanging="360"/>
       </w:pPr>
       <w:rPr>
-        <w:rFonts w:ascii="Symbol" w:eastAsiaTheme="minorHAnsi" w:hAnsi="Symbol" w:cstheme="minorBidi" w:hint="default"/>
+        <w:rFonts w:hint="default"/>
       </w:rPr>
     </w:lvl>
     <w:lvl w:ilvl="1" w:tplc="10090003">
@@ -609,6 +1216,15 @@
     </w:lvl>
   </w:abstractNum>
   <w:num w:numId="1" w16cid:durableId="112142385">
+    <w:abstractNumId w:val="3"/>
+  </w:num>
+  <w:num w:numId="2" w16cid:durableId="696614864">
+    <w:abstractNumId w:val="2"/>
+  </w:num>
+  <w:num w:numId="3" w16cid:durableId="208733421">
+    <w:abstractNumId w:val="1"/>
+  </w:num>
+  <w:num w:numId="4" w16cid:durableId="175271288">
     <w:abstractNumId w:val="0"/>
   </w:num>
 </w:numbering>
@@ -1217,6 +1833,7 @@
   <w:style w:type="character" w:default="1" w:styleId="DefaultParagraphFont">
     <w:name w:val="Default Paragraph Font"/>
     <w:uiPriority w:val="1"/>
+    <w:semiHidden/>
     <w:unhideWhenUsed/>
   </w:style>
   <w:style w:type="table" w:default="1" w:styleId="TableNormal">

</xml_diff>